<commit_message>
Minor fixes, add AI pro, cons
Minor fixes, add AI pro, cons
</commit_message>
<xml_diff>
--- a/02_SWR_Architecture/01_Usecases_Features.docx
+++ b/02_SWR_Architecture/01_Usecases_Features.docx
@@ -18,14 +18,21 @@
         <w:spacing w:after="160"/>
       </w:pPr>
       <w:r>
-        <w:t xml:space="preserve">Monolithic or split </w:t>
-      </w:r>
-      <w:r>
-        <w:rPr>
-          <w:b/>
-          <w:bCs/>
-        </w:rPr>
-        <w:t xml:space="preserve">Next.js + </w:t>
+        <w:t xml:space="preserve">Monolithic </w:t>
+      </w:r>
+      <w:r>
+        <w:rPr>
+          <w:b/>
+          <w:bCs/>
+        </w:rPr>
+        <w:t>React</w:t>
+      </w:r>
+      <w:r>
+        <w:rPr>
+          <w:b/>
+          <w:bCs/>
+        </w:rPr>
+        <w:t xml:space="preserve"> + </w:t>
       </w:r>
       <w:proofErr w:type="spellStart"/>
       <w:r>
@@ -46,6 +53,7 @@
           <w:ilvl w:val="0"/>
           <w:numId w:val="4"/>
         </w:numPr>
+        <w:jc w:val="both"/>
       </w:pPr>
       <w:r>
         <w:rPr>
@@ -55,17 +63,7 @@
         <w:t>Frontend:</w:t>
       </w:r>
       <w:r>
-        <w:t xml:space="preserve"> </w:t>
-      </w:r>
-      <w:r>
-        <w:rPr>
-          <w:b/>
-          <w:bCs/>
-        </w:rPr>
-        <w:t>Next.js</w:t>
-      </w:r>
-      <w:r>
-        <w:t xml:space="preserve"> (React) using standard HTML5 accessibility tags, simple CSS (Tailwind), and browser speech APIs or standard HTTP calls.</w:t>
+        <w:t xml:space="preserve"> React using standard HTML5 accessibility tags, simple CSS (Tailwind), and browser speech APIs or standard HTTP calls.</w:t>
       </w:r>
     </w:p>
     <w:p>
@@ -74,6 +72,7 @@
           <w:ilvl w:val="0"/>
           <w:numId w:val="4"/>
         </w:numPr>
+        <w:jc w:val="both"/>
       </w:pPr>
       <w:r>
         <w:rPr>
@@ -111,6 +110,7 @@
           <w:ilvl w:val="0"/>
           <w:numId w:val="4"/>
         </w:numPr>
+        <w:jc w:val="both"/>
       </w:pPr>
       <w:r>
         <w:rPr>
@@ -126,6 +126,7 @@
           <w:ilvl w:val="1"/>
           <w:numId w:val="4"/>
         </w:numPr>
+        <w:jc w:val="both"/>
       </w:pPr>
       <w:r>
         <w:t>Python PDF library (</w:t>
@@ -161,6 +162,7 @@
           <w:ilvl w:val="1"/>
           <w:numId w:val="4"/>
         </w:numPr>
+        <w:jc w:val="both"/>
       </w:pPr>
       <w:r>
         <w:t>Use a standard API key (like OpenAI/Gemini or an open LLM via API) to generate summaries and flashcards.</w:t>
@@ -172,6 +174,7 @@
           <w:ilvl w:val="0"/>
           <w:numId w:val="4"/>
         </w:numPr>
+        <w:jc w:val="both"/>
       </w:pPr>
       <w:r>
         <w:rPr>
@@ -228,7 +231,31 @@
       <w:bookmarkStart w:id="1" w:name="_z5oy7oikqzrp" w:colFirst="0" w:colLast="0"/>
       <w:bookmarkEnd w:id="1"/>
       <w:r>
-        <w:t>Streamlined UI Design (Web-Focused &amp; Practical)</w:t>
+        <w:t xml:space="preserve">Streamlined UI </w:t>
+      </w:r>
+      <w:r>
+        <w:t>d</w:t>
+      </w:r>
+      <w:r>
+        <w:t>esign (</w:t>
+      </w:r>
+      <w:r>
+        <w:t>w</w:t>
+      </w:r>
+      <w:r>
+        <w:t>eb-</w:t>
+      </w:r>
+      <w:r>
+        <w:t>f</w:t>
+      </w:r>
+      <w:r>
+        <w:t xml:space="preserve">ocused &amp; </w:t>
+      </w:r>
+      <w:r>
+        <w:t>p</w:t>
+      </w:r>
+      <w:r>
+        <w:t>ractical)</w:t>
       </w:r>
     </w:p>
     <w:p>
@@ -236,10 +263,7 @@
         <w:spacing w:after="160"/>
       </w:pPr>
       <w:r>
-        <w:t>T</w:t>
-      </w:r>
-      <w:r>
-        <w:t>he UI needs to be clean, functional, and demonstrate accessibility:</w:t>
+        <w:t>The UI needs to be clean, functional, and demonstrate accessibility:</w:t>
       </w:r>
     </w:p>
     <w:p>
@@ -248,6 +272,7 @@
           <w:ilvl w:val="0"/>
           <w:numId w:val="13"/>
         </w:numPr>
+        <w:jc w:val="both"/>
       </w:pPr>
       <w:r>
         <w:rPr>
@@ -266,6 +291,7 @@
           <w:ilvl w:val="0"/>
           <w:numId w:val="13"/>
         </w:numPr>
+        <w:jc w:val="both"/>
       </w:pPr>
       <w:r>
         <w:rPr>
@@ -275,7 +301,15 @@
         <w:t>Keyboard Navigation First:</w:t>
       </w:r>
       <w:r>
-        <w:t xml:space="preserve"> Every button and link must have clear focus rings (focus:ring-2) and be fully navigable using the Tab key and Enter/Space bars.</w:t>
+        <w:t xml:space="preserve"> Every button and link must have clear focus rings (</w:t>
+      </w:r>
+      <w:proofErr w:type="gramStart"/>
+      <w:r>
+        <w:t>focus:ring</w:t>
+      </w:r>
+      <w:proofErr w:type="gramEnd"/>
+      <w:r>
+        <w:t>-2) and be fully navigable using the Tab key and Enter/Space bars.</w:t>
       </w:r>
     </w:p>
     <w:p>
@@ -284,6 +318,7 @@
           <w:ilvl w:val="0"/>
           <w:numId w:val="13"/>
         </w:numPr>
+        <w:jc w:val="both"/>
       </w:pPr>
       <w:r>
         <w:rPr>
@@ -303,10 +338,12 @@
         <w:t>Web Speech API (</w:t>
       </w:r>
       <w:proofErr w:type="spellStart"/>
+      <w:proofErr w:type="gramStart"/>
       <w:r>
         <w:t>window.speechSynthesis</w:t>
       </w:r>
       <w:proofErr w:type="spellEnd"/>
+      <w:proofErr w:type="gramEnd"/>
       <w:r>
         <w:rPr>
           <w:b/>
@@ -334,9 +371,6 @@
       <w:pPr>
         <w:spacing w:after="160"/>
       </w:pPr>
-      <w:r>
-        <w:t xml:space="preserve"> </w:t>
-      </w:r>
     </w:p>
     <w:p>
       <w:pPr>
@@ -346,7 +380,22 @@
       <w:bookmarkStart w:id="2" w:name="_v40hvc8i25ck" w:colFirst="0" w:colLast="0"/>
       <w:bookmarkEnd w:id="2"/>
       <w:r>
-        <w:t>Team work Split (6 Members)</w:t>
+        <w:t>Teamwork</w:t>
+      </w:r>
+      <w:r>
+        <w:t xml:space="preserve"> </w:t>
+      </w:r>
+      <w:r>
+        <w:t>s</w:t>
+      </w:r>
+      <w:r>
+        <w:t xml:space="preserve">plit (6 </w:t>
+      </w:r>
+      <w:r>
+        <w:t>m</w:t>
+      </w:r>
+      <w:r>
+        <w:t>embers)</w:t>
       </w:r>
     </w:p>
     <w:p>
@@ -354,7 +403,13 @@
         <w:spacing w:after="160"/>
       </w:pPr>
       <w:r>
-        <w:t>💻 Frontend Team (3 Members)</w:t>
+        <w:t xml:space="preserve">💻 Frontend Team (3 </w:t>
+      </w:r>
+      <w:r>
+        <w:t>m</w:t>
+      </w:r>
+      <w:r>
+        <w:t>embers)</w:t>
       </w:r>
     </w:p>
     <w:p>
@@ -363,6 +418,7 @@
           <w:ilvl w:val="0"/>
           <w:numId w:val="3"/>
         </w:numPr>
+        <w:jc w:val="both"/>
       </w:pPr>
       <w:r>
         <w:rPr>
@@ -372,7 +428,13 @@
         <w:t>UI Layout &amp; Dashboard:</w:t>
       </w:r>
       <w:r>
-        <w:t xml:space="preserve"> Build the main web pages (Home, Document Upload, Deck View, Flashcard Review screen) using Next.js and Tailwind CSS.</w:t>
+        <w:t xml:space="preserve"> Build the main web pages (Home, Document Upload, Deck View, Flashcard Review screen) using </w:t>
+      </w:r>
+      <w:r>
+        <w:t>React</w:t>
+      </w:r>
+      <w:r>
+        <w:t xml:space="preserve"> and Tailwind CSS.</w:t>
       </w:r>
     </w:p>
     <w:p>
@@ -381,6 +443,7 @@
           <w:ilvl w:val="0"/>
           <w:numId w:val="3"/>
         </w:numPr>
+        <w:jc w:val="both"/>
       </w:pPr>
       <w:r>
         <w:rPr>
@@ -399,6 +462,7 @@
           <w:ilvl w:val="0"/>
           <w:numId w:val="3"/>
         </w:numPr>
+        <w:jc w:val="both"/>
       </w:pPr>
       <w:r>
         <w:rPr>
@@ -448,7 +512,21 @@
           <w:b/>
           <w:bCs/>
         </w:rPr>
-        <w:t>⚙️ Backend &amp; AI Team (3 Members)</w:t>
+        <w:t xml:space="preserve">⚙️ Backend &amp; AI </w:t>
+      </w:r>
+      <w:r>
+        <w:rPr>
+          <w:b/>
+          <w:bCs/>
+        </w:rPr>
+        <w:t>t</w:t>
+      </w:r>
+      <w:r>
+        <w:rPr>
+          <w:b/>
+          <w:bCs/>
+        </w:rPr>
+        <w:t>eam (3 Members)</w:t>
       </w:r>
     </w:p>
     <w:p>
@@ -545,6 +623,7 @@
       <w:pPr>
         <w:spacing w:after="160"/>
         <w:ind w:firstLine="720"/>
+        <w:jc w:val="both"/>
       </w:pPr>
       <w:r>
         <w:t>To satisfy the project description ("upload a PDF, system parses it, summarises key points, automatically generates study flashcards, available in text and voice"), focus shall be on these core milestones:</w:t>
@@ -556,6 +635,7 @@
           <w:ilvl w:val="0"/>
           <w:numId w:val="16"/>
         </w:numPr>
+        <w:jc w:val="both"/>
         <w:rPr>
           <w:b/>
           <w:bCs/>
@@ -571,10 +651,8 @@
     </w:p>
     <w:p>
       <w:pPr>
-        <w:numPr>
-          <w:ilvl w:val="0"/>
-          <w:numId w:val="5"/>
-        </w:numPr>
+        <w:ind w:left="720"/>
+        <w:jc w:val="both"/>
       </w:pPr>
       <w:r>
         <w:t xml:space="preserve">Support for selecting and switching between </w:t>
@@ -624,6 +702,7 @@
           <w:ilvl w:val="0"/>
           <w:numId w:val="16"/>
         </w:numPr>
+        <w:jc w:val="both"/>
         <w:rPr>
           <w:b/>
           <w:bCs/>
@@ -639,10 +718,8 @@
     </w:p>
     <w:p>
       <w:pPr>
-        <w:numPr>
-          <w:ilvl w:val="0"/>
-          <w:numId w:val="8"/>
-        </w:numPr>
+        <w:ind w:left="720"/>
+        <w:jc w:val="both"/>
       </w:pPr>
       <w:r>
         <w:t>Ability to upload PDF course documents via a standard screen-reader-friendly file picker or through voice commands (</w:t>
@@ -664,6 +741,7 @@
           <w:ilvl w:val="0"/>
           <w:numId w:val="16"/>
         </w:numPr>
+        <w:jc w:val="both"/>
         <w:rPr>
           <w:b/>
           <w:bCs/>
@@ -679,10 +757,8 @@
     </w:p>
     <w:p>
       <w:pPr>
-        <w:numPr>
-          <w:ilvl w:val="0"/>
-          <w:numId w:val="6"/>
-        </w:numPr>
+        <w:ind w:left="720"/>
+        <w:jc w:val="both"/>
       </w:pPr>
       <w:r>
         <w:t>Backend extraction of text, headings, and tables from PDFs, paired with Romanian text normalization (handling legacy diacritics like cedillas vs. commas-below).</w:t>
@@ -694,6 +770,7 @@
           <w:ilvl w:val="0"/>
           <w:numId w:val="16"/>
         </w:numPr>
+        <w:jc w:val="both"/>
         <w:rPr>
           <w:b/>
           <w:bCs/>
@@ -709,10 +786,8 @@
     </w:p>
     <w:p>
       <w:pPr>
-        <w:numPr>
-          <w:ilvl w:val="0"/>
-          <w:numId w:val="11"/>
-        </w:numPr>
+        <w:ind w:left="720"/>
+        <w:jc w:val="both"/>
       </w:pPr>
       <w:r>
         <w:t>Automatic generation of section-level and global document summaries optimized for listening (short sentences, expanded abbreviations, clear structural cues).</w:t>
@@ -724,6 +799,7 @@
           <w:ilvl w:val="0"/>
           <w:numId w:val="16"/>
         </w:numPr>
+        <w:jc w:val="both"/>
         <w:rPr>
           <w:b/>
           <w:bCs/>
@@ -739,10 +815,8 @@
     </w:p>
     <w:p>
       <w:pPr>
-        <w:numPr>
-          <w:ilvl w:val="0"/>
-          <w:numId w:val="20"/>
-        </w:numPr>
+        <w:ind w:left="720"/>
+        <w:jc w:val="both"/>
       </w:pPr>
       <w:r>
         <w:t>AI generation of question-and-answer study flashcards from document chunks, where every card carries mandatory source page/chunk citations and starts as a reviewable draft.</w:t>
@@ -754,6 +828,7 @@
           <w:ilvl w:val="0"/>
           <w:numId w:val="16"/>
         </w:numPr>
+        <w:jc w:val="both"/>
         <w:rPr>
           <w:b/>
           <w:bCs/>
@@ -769,10 +844,8 @@
     </w:p>
     <w:p>
       <w:pPr>
-        <w:numPr>
-          <w:ilvl w:val="0"/>
-          <w:numId w:val="14"/>
-        </w:numPr>
+        <w:ind w:left="720"/>
+        <w:jc w:val="both"/>
       </w:pPr>
       <w:r>
         <w:t xml:space="preserve">Interactive review sessions operable entirely via keyboard shortcuts or voice commands (e.g., </w:t>
@@ -824,48 +897,209 @@
           <w:ilvl w:val="0"/>
           <w:numId w:val="16"/>
         </w:numPr>
-        <w:rPr>
-          <w:b/>
-          <w:bCs/>
-        </w:rPr>
-      </w:pPr>
-      <w:r>
-        <w:rPr>
-          <w:b/>
-          <w:bCs/>
-        </w:rPr>
-        <w:t xml:space="preserve"> Spaced Repetition &amp; Progress Tracking (FSRS)</w:t>
-      </w:r>
-    </w:p>
-    <w:p>
-      <w:pPr>
+        <w:jc w:val="both"/>
+        <w:rPr>
+          <w:b/>
+          <w:bCs/>
+        </w:rPr>
+      </w:pPr>
+      <w:r>
+        <w:rPr>
+          <w:b/>
+          <w:bCs/>
+        </w:rPr>
+        <w:t>Spaced Repetition &amp; Progress Tracking (FSRS)</w:t>
+      </w:r>
+    </w:p>
+    <w:p>
+      <w:pPr>
+        <w:spacing w:after="240"/>
+        <w:ind w:left="720"/>
+        <w:jc w:val="both"/>
+      </w:pPr>
+      <w:r>
+        <w:t>Integration of the FSRS algorithm (</w:t>
+      </w:r>
+      <w:proofErr w:type="spellStart"/>
+      <w:r>
+        <w:rPr>
+          <w:color w:val="188038"/>
+        </w:rPr>
+        <w:t>ts-fsrs</w:t>
+      </w:r>
+      <w:proofErr w:type="spellEnd"/>
+      <w:r>
+        <w:t>) to schedule card reviews, log response latencies, and provide structured three-level feedback (task, process, self-regulation).</w:t>
+      </w:r>
+    </w:p>
+    <w:p>
+      <w:pPr>
+        <w:pStyle w:val="Heading3"/>
+        <w:spacing w:after="160"/>
+      </w:pPr>
+      <w:r>
+        <w:t>Advanced features</w:t>
+      </w:r>
+    </w:p>
+    <w:p>
+      <w:pPr>
+        <w:pStyle w:val="ListParagraph"/>
         <w:numPr>
           <w:ilvl w:val="0"/>
-          <w:numId w:val="10"/>
-        </w:numPr>
+          <w:numId w:val="16"/>
+        </w:numPr>
+        <w:jc w:val="both"/>
+        <w:rPr>
+          <w:b/>
+          <w:bCs/>
+        </w:rPr>
+      </w:pPr>
+      <w:r>
+        <w:rPr>
+          <w:b/>
+          <w:bCs/>
+          <w:lang w:val="en-US"/>
+        </w:rPr>
+        <w:t>Real-Time Collaborative Audio Study Rooms (Multi-User)</w:t>
+      </w:r>
+    </w:p>
+    <w:p>
+      <w:pPr>
         <w:spacing w:after="240"/>
-      </w:pPr>
-      <w:r>
-        <w:t>Integration of the FSRS algorithm (</w:t>
+        <w:ind w:left="720"/>
+        <w:jc w:val="both"/>
+      </w:pPr>
+      <w:r>
+        <w:t>Enables visually impaired students to join peer study sessions, share curated flashcard decks, and conduct group spaced-repetition quizzes over WebRTC.</w:t>
+      </w:r>
+    </w:p>
+    <w:p>
+      <w:pPr>
+        <w:pStyle w:val="ListParagraph"/>
+        <w:numPr>
+          <w:ilvl w:val="0"/>
+          <w:numId w:val="16"/>
+        </w:numPr>
+        <w:jc w:val="both"/>
+        <w:rPr>
+          <w:b/>
+          <w:bCs/>
+        </w:rPr>
+      </w:pPr>
+      <w:r>
+        <w:rPr>
+          <w:b/>
+          <w:bCs/>
+        </w:rPr>
+        <w:t>Multimodal Image-to-Audio Diagram &amp; Formula Parser (Exotic AI)</w:t>
+      </w:r>
+    </w:p>
+    <w:p>
+      <w:pPr>
+        <w:pStyle w:val="NormalWeb"/>
+        <w:ind w:left="720"/>
+        <w:jc w:val="both"/>
+        <w:rPr>
+          <w:rFonts w:ascii="Arial" w:eastAsia="Arial" w:hAnsi="Arial" w:cs="Arial"/>
+          <w:sz w:val="22"/>
+          <w:szCs w:val="22"/>
+          <w:lang w:val="en-GB"/>
+        </w:rPr>
+      </w:pPr>
+      <w:r>
+        <w:rPr>
+          <w:rFonts w:ascii="Arial" w:eastAsia="Arial" w:hAnsi="Arial" w:cs="Arial"/>
+          <w:sz w:val="22"/>
+          <w:szCs w:val="22"/>
+          <w:lang w:val="en-GB"/>
+        </w:rPr>
+        <w:lastRenderedPageBreak/>
+        <w:t xml:space="preserve">Extends the </w:t>
       </w:r>
       <w:proofErr w:type="spellStart"/>
       <w:r>
         <w:rPr>
-          <w:color w:val="188038"/>
-        </w:rPr>
-        <w:t>ts-fsrs</w:t>
+          <w:rFonts w:ascii="Arial" w:eastAsia="Arial" w:hAnsi="Arial" w:cs="Arial"/>
+          <w:sz w:val="22"/>
+          <w:szCs w:val="22"/>
+          <w:lang w:val="en-GB"/>
+        </w:rPr>
+        <w:t>Docling</w:t>
       </w:r>
       <w:proofErr w:type="spellEnd"/>
       <w:r>
-        <w:t>) to schedule card reviews, log response latencies, and provide structured three-level feedback (task, process, self-regulation).</w:t>
-      </w:r>
-    </w:p>
-    <w:p/>
-    <w:p/>
-    <w:p/>
-    <w:p/>
-    <w:p/>
-    <w:p/>
+        <w:rPr>
+          <w:rFonts w:ascii="Arial" w:eastAsia="Arial" w:hAnsi="Arial" w:cs="Arial"/>
+          <w:sz w:val="22"/>
+          <w:szCs w:val="22"/>
+          <w:lang w:val="en-GB"/>
+        </w:rPr>
+        <w:t xml:space="preserve"> parsing pipeline to handle STEM textbooks containing complex diagrams, mathematical equations, and visual tables that screen readers traditionally skip.</w:t>
+      </w:r>
+    </w:p>
+    <w:p>
+      <w:pPr>
+        <w:pStyle w:val="NormalWeb"/>
+        <w:numPr>
+          <w:ilvl w:val="0"/>
+          <w:numId w:val="16"/>
+        </w:numPr>
+        <w:jc w:val="both"/>
+      </w:pPr>
+      <w:r>
+        <w:rPr>
+          <w:rFonts w:ascii="Arial" w:eastAsia="Arial" w:hAnsi="Arial" w:cs="Arial"/>
+          <w:b/>
+          <w:bCs/>
+          <w:sz w:val="22"/>
+          <w:szCs w:val="22"/>
+          <w:lang w:val="en-GB"/>
+        </w:rPr>
+        <w:t>Tactile &amp; Refreshable Braille Display Support (HW Interoperability</w:t>
+      </w:r>
+      <w:r>
+        <w:rPr>
+          <w:rFonts w:ascii="Arial" w:eastAsia="Arial" w:hAnsi="Arial" w:cs="Arial"/>
+          <w:b/>
+          <w:bCs/>
+          <w:sz w:val="22"/>
+          <w:szCs w:val="22"/>
+          <w:lang w:val="en-GB"/>
+        </w:rPr>
+        <w:t>)</w:t>
+      </w:r>
+      <w:r>
+        <w:br/>
+      </w:r>
+      <w:r>
+        <w:rPr>
+          <w:rFonts w:ascii="Arial" w:eastAsia="Arial" w:hAnsi="Arial" w:cs="Arial"/>
+          <w:sz w:val="22"/>
+          <w:szCs w:val="22"/>
+          <w:lang w:val="en-GB"/>
+        </w:rPr>
+        <w:t>Provides hardware-level output for visually impaired students who rely on tactile reading devices alongside or instead of speech.</w:t>
+      </w:r>
+    </w:p>
+    <w:p>
+      <w:pPr>
+        <w:spacing w:after="240"/>
+        <w:rPr>
+          <w:lang w:val="en-US"/>
+        </w:rPr>
+      </w:pPr>
+    </w:p>
+    <w:p>
+      <w:r>
+        <w:br w:type="page"/>
+      </w:r>
+    </w:p>
+    <w:p>
+      <w:pPr>
+        <w:spacing w:after="240"/>
+        <w:ind w:left="720"/>
+      </w:pPr>
+    </w:p>
     <w:p>
       <w:pPr>
         <w:ind w:firstLine="720"/>
@@ -877,13 +1111,7 @@
         <w:rPr>
           <w:color w:val="1F1F1F"/>
         </w:rPr>
-        <w:t>Below</w:t>
-      </w:r>
-      <w:r>
-        <w:rPr>
-          <w:color w:val="1F1F1F"/>
-        </w:rPr>
-        <w:t xml:space="preserve"> is the breakdown of the </w:t>
+        <w:t xml:space="preserve">Below is the breakdown of the </w:t>
       </w:r>
       <w:r>
         <w:rPr>
@@ -911,14 +1139,7 @@
         <w:rPr>
           <w:color w:val="1F1F1F"/>
         </w:rPr>
-        <w:t xml:space="preserve"> for the web application. Because the system is designed primarily for visually impaired learners, every </w:t>
-      </w:r>
-      <w:r>
-        <w:rPr>
-          <w:color w:val="1F1F1F"/>
-        </w:rPr>
-        <w:lastRenderedPageBreak/>
-        <w:t xml:space="preserve">major interaction can be performed through </w:t>
+        <w:t xml:space="preserve"> for the web application. Because the system is designed primarily for visually impaired learners, every major interaction can be performed through </w:t>
       </w:r>
       <w:r>
         <w:rPr>
@@ -975,6 +1196,7 @@
           <w:ilvl w:val="0"/>
           <w:numId w:val="7"/>
         </w:numPr>
+        <w:jc w:val="both"/>
       </w:pPr>
       <w:r>
         <w:rPr>
@@ -1053,6 +1275,7 @@
           <w:ilvl w:val="0"/>
           <w:numId w:val="7"/>
         </w:numPr>
+        <w:jc w:val="both"/>
       </w:pPr>
       <w:r>
         <w:rPr>
@@ -1075,6 +1298,7 @@
           <w:ilvl w:val="0"/>
           <w:numId w:val="7"/>
         </w:numPr>
+        <w:jc w:val="both"/>
       </w:pPr>
       <w:r>
         <w:rPr>
@@ -1097,6 +1321,7 @@
           <w:ilvl w:val="0"/>
           <w:numId w:val="7"/>
         </w:numPr>
+        <w:jc w:val="both"/>
       </w:pPr>
       <w:r>
         <w:rPr>
@@ -1249,6 +1474,7 @@
           <w:ilvl w:val="1"/>
           <w:numId w:val="15"/>
         </w:numPr>
+        <w:jc w:val="both"/>
       </w:pPr>
       <w:r>
         <w:rPr>
@@ -1277,6 +1503,7 @@
           <w:ilvl w:val="1"/>
           <w:numId w:val="15"/>
         </w:numPr>
+        <w:jc w:val="both"/>
       </w:pPr>
       <w:r>
         <w:rPr>
@@ -1291,6 +1518,7 @@
           <w:ilvl w:val="1"/>
           <w:numId w:val="15"/>
         </w:numPr>
+        <w:jc w:val="both"/>
       </w:pPr>
       <w:r>
         <w:rPr>
@@ -1305,6 +1533,7 @@
           <w:ilvl w:val="1"/>
           <w:numId w:val="15"/>
         </w:numPr>
+        <w:jc w:val="both"/>
       </w:pPr>
       <w:r>
         <w:rPr>
@@ -1421,6 +1650,7 @@
           <w:ilvl w:val="1"/>
           <w:numId w:val="2"/>
         </w:numPr>
+        <w:jc w:val="both"/>
       </w:pPr>
       <w:r>
         <w:rPr>
@@ -1449,6 +1679,7 @@
           <w:ilvl w:val="1"/>
           <w:numId w:val="2"/>
         </w:numPr>
+        <w:jc w:val="both"/>
       </w:pPr>
       <w:r>
         <w:rPr>
@@ -1463,6 +1694,7 @@
           <w:ilvl w:val="1"/>
           <w:numId w:val="2"/>
         </w:numPr>
+        <w:jc w:val="both"/>
       </w:pPr>
       <w:r>
         <w:rPr>
@@ -1547,6 +1779,7 @@
           <w:bCs/>
           <w:color w:val="1F1F1F"/>
         </w:rPr>
+        <w:lastRenderedPageBreak/>
         <w:t>Actor:</w:t>
       </w:r>
       <w:r>
@@ -1600,12 +1833,12 @@
           <w:ilvl w:val="1"/>
           <w:numId w:val="1"/>
         </w:numPr>
-      </w:pPr>
-      <w:r>
-        <w:rPr>
-          <w:color w:val="1F1F1F"/>
-        </w:rPr>
-        <w:lastRenderedPageBreak/>
+        <w:jc w:val="both"/>
+      </w:pPr>
+      <w:r>
+        <w:rPr>
+          <w:color w:val="1F1F1F"/>
+        </w:rPr>
         <w:t xml:space="preserve">The student </w:t>
       </w:r>
       <w:r>
@@ -1641,6 +1874,7 @@
           <w:ilvl w:val="1"/>
           <w:numId w:val="1"/>
         </w:numPr>
+        <w:jc w:val="both"/>
       </w:pPr>
       <w:r>
         <w:rPr>
@@ -1671,6 +1905,7 @@
           <w:ilvl w:val="1"/>
           <w:numId w:val="1"/>
         </w:numPr>
+        <w:jc w:val="both"/>
       </w:pPr>
       <w:r>
         <w:rPr>
@@ -1707,6 +1942,7 @@
           <w:ilvl w:val="1"/>
           <w:numId w:val="1"/>
         </w:numPr>
+        <w:jc w:val="both"/>
       </w:pPr>
       <w:r>
         <w:rPr>
@@ -1757,6 +1993,7 @@
           <w:ilvl w:val="1"/>
           <w:numId w:val="1"/>
         </w:numPr>
+        <w:jc w:val="both"/>
       </w:pPr>
       <w:r>
         <w:rPr>
@@ -1874,6 +2111,7 @@
           <w:ilvl w:val="1"/>
           <w:numId w:val="19"/>
         </w:numPr>
+        <w:jc w:val="both"/>
       </w:pPr>
       <w:r>
         <w:rPr>
@@ -1888,6 +2126,7 @@
           <w:ilvl w:val="1"/>
           <w:numId w:val="19"/>
         </w:numPr>
+        <w:jc w:val="both"/>
       </w:pPr>
       <w:r>
         <w:rPr>
@@ -1902,6 +2141,7 @@
           <w:ilvl w:val="1"/>
           <w:numId w:val="19"/>
         </w:numPr>
+        <w:jc w:val="both"/>
       </w:pPr>
       <w:r>
         <w:rPr>
@@ -1999,6 +2239,7 @@
           <w:ilvl w:val="1"/>
           <w:numId w:val="17"/>
         </w:numPr>
+        <w:jc w:val="both"/>
       </w:pPr>
       <w:r>
         <w:rPr>
@@ -2027,6 +2268,7 @@
           <w:ilvl w:val="1"/>
           <w:numId w:val="17"/>
         </w:numPr>
+        <w:jc w:val="both"/>
       </w:pPr>
       <w:r>
         <w:rPr>
@@ -2055,6 +2297,7 @@
           <w:ilvl w:val="1"/>
           <w:numId w:val="17"/>
         </w:numPr>
+        <w:jc w:val="both"/>
       </w:pPr>
       <w:r>
         <w:rPr>
@@ -2070,6 +2313,7 @@
           <w:ilvl w:val="2"/>
           <w:numId w:val="17"/>
         </w:numPr>
+        <w:jc w:val="both"/>
       </w:pPr>
       <w:r>
         <w:t xml:space="preserve">The app plays a subtle confirmation </w:t>
@@ -2089,6 +2333,7 @@
           <w:ilvl w:val="2"/>
           <w:numId w:val="17"/>
         </w:numPr>
+        <w:jc w:val="both"/>
       </w:pPr>
       <w:r>
         <w:t xml:space="preserve">The app's Text-to-Speech (TTS) responds: </w:t>
@@ -2110,6 +2355,7 @@
           <w:ilvl w:val="2"/>
           <w:numId w:val="17"/>
         </w:numPr>
+        <w:jc w:val="both"/>
       </w:pPr>
       <w:r>
         <w:t>The system programmatically triggers the hidden native file picker dialog on the browser.</w:t>
@@ -2121,6 +2367,7 @@
           <w:ilvl w:val="1"/>
           <w:numId w:val="17"/>
         </w:numPr>
+        <w:jc w:val="both"/>
       </w:pPr>
       <w:r>
         <w:rPr>
@@ -2139,6 +2386,7 @@
           <w:ilvl w:val="1"/>
           <w:numId w:val="17"/>
         </w:numPr>
+        <w:jc w:val="both"/>
       </w:pPr>
       <w:r>
         <w:rPr>
@@ -2154,6 +2402,7 @@
           <w:ilvl w:val="2"/>
           <w:numId w:val="17"/>
         </w:numPr>
+        <w:jc w:val="both"/>
       </w:pPr>
       <w:r>
         <w:t>The file is sent via HTTP POST to the backend API.</w:t>
@@ -2165,6 +2414,7 @@
           <w:ilvl w:val="2"/>
           <w:numId w:val="17"/>
         </w:numPr>
+        <w:jc w:val="both"/>
       </w:pPr>
       <w:r>
         <w:t xml:space="preserve">As the backend processes the file, the system provides audio feedback: </w:t>
@@ -2183,12 +2433,14 @@
           <w:ilvl w:val="1"/>
           <w:numId w:val="17"/>
         </w:numPr>
-      </w:pPr>
-      <w:r>
-        <w:rPr>
-          <w:b/>
-          <w:bCs/>
-        </w:rPr>
+        <w:jc w:val="both"/>
+      </w:pPr>
+      <w:r>
+        <w:rPr>
+          <w:b/>
+          <w:bCs/>
+        </w:rPr>
+        <w:lastRenderedPageBreak/>
         <w:t>Completion:</w:t>
       </w:r>
       <w:r>
@@ -2199,22 +2451,7 @@
           <w:i/>
           <w:iCs/>
         </w:rPr>
-        <w:t xml:space="preserve">"Document ready. 4 sections and 15 flashcards created. Say </w:t>
-      </w:r>
-      <w:r>
-        <w:rPr>
-          <w:i/>
-          <w:iCs/>
-        </w:rPr>
-        <w:lastRenderedPageBreak/>
-        <w:t>'start review' to begin."</w:t>
-      </w:r>
-      <w:r>
-        <w:rPr>
-          <w:i/>
-          <w:iCs/>
-        </w:rPr>
-        <w:br/>
+        <w:t>"Document ready. 4 sections and 15 flashcards created. Say 'start review' to begin."</w:t>
       </w:r>
     </w:p>
     <w:p>
@@ -2321,6 +2558,7 @@
           <w:ilvl w:val="1"/>
           <w:numId w:val="18"/>
         </w:numPr>
+        <w:jc w:val="both"/>
       </w:pPr>
       <w:r>
         <w:rPr>
@@ -2339,6 +2577,7 @@
           <w:ilvl w:val="1"/>
           <w:numId w:val="18"/>
         </w:numPr>
+        <w:jc w:val="both"/>
       </w:pPr>
       <w:r>
         <w:rPr>
@@ -2358,6 +2597,7 @@
           <w:numId w:val="18"/>
         </w:numPr>
         <w:spacing w:after="240"/>
+        <w:jc w:val="both"/>
       </w:pPr>
       <w:r>
         <w:rPr>
@@ -2382,6 +2622,7 @@
     <w:p>
       <w:pPr>
         <w:spacing w:after="40"/>
+        <w:jc w:val="both"/>
       </w:pPr>
       <w:r>
         <w:t>Main Flow:</w:t>
@@ -2393,6 +2634,7 @@
           <w:ilvl w:val="0"/>
           <w:numId w:val="9"/>
         </w:numPr>
+        <w:jc w:val="both"/>
       </w:pPr>
       <w:r>
         <w:rPr>
@@ -2408,6 +2650,7 @@
           <w:ilvl w:val="1"/>
           <w:numId w:val="9"/>
         </w:numPr>
+        <w:jc w:val="both"/>
       </w:pPr>
       <w:r>
         <w:rPr>
@@ -2435,6 +2678,7 @@
           <w:ilvl w:val="1"/>
           <w:numId w:val="9"/>
         </w:numPr>
+        <w:jc w:val="both"/>
       </w:pPr>
       <w:r>
         <w:rPr>
@@ -2470,6 +2714,7 @@
           <w:ilvl w:val="0"/>
           <w:numId w:val="9"/>
         </w:numPr>
+        <w:jc w:val="both"/>
       </w:pPr>
       <w:r>
         <w:rPr>
@@ -2485,6 +2730,7 @@
           <w:ilvl w:val="1"/>
           <w:numId w:val="9"/>
         </w:numPr>
+        <w:jc w:val="both"/>
       </w:pPr>
       <w:r>
         <w:rPr>
@@ -2513,6 +2759,7 @@
           <w:ilvl w:val="1"/>
           <w:numId w:val="9"/>
         </w:numPr>
+        <w:jc w:val="both"/>
       </w:pPr>
       <w:r>
         <w:rPr>
@@ -2531,6 +2778,12 @@
         </w:rPr>
         <w:t>"Card 1. Front: What is a mutex? Back: A mutual exclusion object used to synchronize access to resources. Source citation: Page 14, Section 2. Status: Draft."</w:t>
       </w:r>
+    </w:p>
+    <w:p>
+      <w:pPr>
+        <w:ind w:left="1440"/>
+        <w:jc w:val="both"/>
+      </w:pPr>
       <w:r>
         <w:rPr>
           <w:i/>
@@ -2545,6 +2798,7 @@
           <w:ilvl w:val="0"/>
           <w:numId w:val="9"/>
         </w:numPr>
+        <w:jc w:val="both"/>
       </w:pPr>
       <w:r>
         <w:rPr>
@@ -2560,6 +2814,7 @@
           <w:ilvl w:val="1"/>
           <w:numId w:val="9"/>
         </w:numPr>
+        <w:jc w:val="both"/>
       </w:pPr>
       <w:r>
         <w:t>Both actors review the card and choose one of three actions, accessible via mouse click, keyboard shortcuts (</w:t>
@@ -2589,6 +2844,7 @@
           <w:ilvl w:val="2"/>
           <w:numId w:val="9"/>
         </w:numPr>
+        <w:jc w:val="both"/>
       </w:pPr>
       <w:r>
         <w:rPr>
@@ -2600,6 +2856,7 @@
       <w:r>
         <w:t xml:space="preserve"> The user clicks the "Approve" button, presses </w:t>
       </w:r>
+      <w:proofErr w:type="gramStart"/>
       <w:r>
         <w:rPr>
           <w:color w:val="188038"/>
@@ -2607,7 +2864,11 @@
         <w:t>Enter</w:t>
       </w:r>
       <w:r>
-        <w:t xml:space="preserve">, or speaks </w:t>
+        <w:t>, or</w:t>
+      </w:r>
+      <w:proofErr w:type="gramEnd"/>
+      <w:r>
+        <w:t xml:space="preserve"> speaks </w:t>
       </w:r>
       <w:r>
         <w:rPr>
@@ -2644,6 +2905,7 @@
           <w:ilvl w:val="2"/>
           <w:numId w:val="9"/>
         </w:numPr>
+        <w:jc w:val="both"/>
       </w:pPr>
       <w:r>
         <w:rPr>
@@ -2671,6 +2933,7 @@
           <w:ilvl w:val="2"/>
           <w:numId w:val="9"/>
         </w:numPr>
+        <w:jc w:val="both"/>
       </w:pPr>
       <w:r>
         <w:rPr>
@@ -2683,6 +2946,7 @@
       <w:r>
         <w:t xml:space="preserve"> If the AI hallucinated or created an unhelpful card, the user clicks "Reject", presses </w:t>
       </w:r>
+      <w:proofErr w:type="gramStart"/>
       <w:r>
         <w:rPr>
           <w:color w:val="188038"/>
@@ -2690,7 +2954,11 @@
         <w:t>Delete</w:t>
       </w:r>
       <w:r>
-        <w:t xml:space="preserve">, or speaks </w:t>
+        <w:t>, or</w:t>
+      </w:r>
+      <w:proofErr w:type="gramEnd"/>
+      <w:r>
+        <w:t xml:space="preserve"> speaks </w:t>
       </w:r>
       <w:r>
         <w:rPr>
@@ -2709,6 +2977,7 @@
           <w:ilvl w:val="0"/>
           <w:numId w:val="9"/>
         </w:numPr>
+        <w:jc w:val="both"/>
       </w:pPr>
       <w:r>
         <w:rPr>
@@ -2725,6 +2994,7 @@
           <w:numId w:val="9"/>
         </w:numPr>
         <w:spacing w:after="240"/>
+        <w:jc w:val="both"/>
       </w:pPr>
       <w:r>
         <w:t>The system advances to the next card, updating both the visual UI focus ring and the audio announcement (</w:t>
@@ -2743,6 +3013,7 @@
     <w:p>
       <w:pPr>
         <w:spacing w:after="40"/>
+        <w:jc w:val="both"/>
       </w:pPr>
       <w:r>
         <w:t>Alternative Flow (Quick Batch Approval):</w:t>
@@ -2755,6 +3026,7 @@
           <w:numId w:val="12"/>
         </w:numPr>
         <w:spacing w:after="240"/>
+        <w:jc w:val="both"/>
       </w:pPr>
       <w:r>
         <w:t>If the user or teacher checks the first few cards and trusts the extraction quality, they can trigger a bulk action via button click, keyboard shortcut, or voice command (</w:t>
@@ -4635,6 +4907,119 @@
     </w:lvl>
   </w:abstractNum>
   <w:abstractNum w:abstractNumId="16" w15:restartNumberingAfterBreak="0">
+    <w:nsid w:val="55FB3ABF"/>
+    <w:multiLevelType w:val="multilevel"/>
+    <w:tmpl w:val="04880DC0"/>
+    <w:lvl w:ilvl="0">
+      <w:start w:val="1"/>
+      <w:numFmt w:val="decimal"/>
+      <w:lvlText w:val="%1."/>
+      <w:lvlJc w:val="left"/>
+      <w:pPr>
+        <w:ind w:left="720" w:hanging="360"/>
+      </w:pPr>
+      <w:rPr>
+        <w:u w:val="none"/>
+      </w:rPr>
+    </w:lvl>
+    <w:lvl w:ilvl="1">
+      <w:start w:val="1"/>
+      <w:numFmt w:val="lowerLetter"/>
+      <w:lvlText w:val="%2."/>
+      <w:lvlJc w:val="left"/>
+      <w:pPr>
+        <w:ind w:left="1440" w:hanging="360"/>
+      </w:pPr>
+      <w:rPr>
+        <w:u w:val="none"/>
+      </w:rPr>
+    </w:lvl>
+    <w:lvl w:ilvl="2">
+      <w:start w:val="1"/>
+      <w:numFmt w:val="lowerRoman"/>
+      <w:lvlText w:val="%3."/>
+      <w:lvlJc w:val="right"/>
+      <w:pPr>
+        <w:ind w:left="2160" w:hanging="360"/>
+      </w:pPr>
+      <w:rPr>
+        <w:u w:val="none"/>
+      </w:rPr>
+    </w:lvl>
+    <w:lvl w:ilvl="3">
+      <w:start w:val="1"/>
+      <w:numFmt w:val="decimal"/>
+      <w:lvlText w:val="%4."/>
+      <w:lvlJc w:val="left"/>
+      <w:pPr>
+        <w:ind w:left="2880" w:hanging="360"/>
+      </w:pPr>
+      <w:rPr>
+        <w:u w:val="none"/>
+      </w:rPr>
+    </w:lvl>
+    <w:lvl w:ilvl="4">
+      <w:start w:val="1"/>
+      <w:numFmt w:val="lowerLetter"/>
+      <w:lvlText w:val="%5."/>
+      <w:lvlJc w:val="left"/>
+      <w:pPr>
+        <w:ind w:left="3600" w:hanging="360"/>
+      </w:pPr>
+      <w:rPr>
+        <w:u w:val="none"/>
+      </w:rPr>
+    </w:lvl>
+    <w:lvl w:ilvl="5">
+      <w:start w:val="1"/>
+      <w:numFmt w:val="lowerRoman"/>
+      <w:lvlText w:val="%6."/>
+      <w:lvlJc w:val="right"/>
+      <w:pPr>
+        <w:ind w:left="4320" w:hanging="360"/>
+      </w:pPr>
+      <w:rPr>
+        <w:u w:val="none"/>
+      </w:rPr>
+    </w:lvl>
+    <w:lvl w:ilvl="6">
+      <w:start w:val="1"/>
+      <w:numFmt w:val="decimal"/>
+      <w:lvlText w:val="%7."/>
+      <w:lvlJc w:val="left"/>
+      <w:pPr>
+        <w:ind w:left="5040" w:hanging="360"/>
+      </w:pPr>
+      <w:rPr>
+        <w:u w:val="none"/>
+      </w:rPr>
+    </w:lvl>
+    <w:lvl w:ilvl="7">
+      <w:start w:val="1"/>
+      <w:numFmt w:val="lowerLetter"/>
+      <w:lvlText w:val="%8."/>
+      <w:lvlJc w:val="left"/>
+      <w:pPr>
+        <w:ind w:left="5760" w:hanging="360"/>
+      </w:pPr>
+      <w:rPr>
+        <w:u w:val="none"/>
+      </w:rPr>
+    </w:lvl>
+    <w:lvl w:ilvl="8">
+      <w:start w:val="1"/>
+      <w:numFmt w:val="lowerRoman"/>
+      <w:lvlText w:val="%9."/>
+      <w:lvlJc w:val="right"/>
+      <w:pPr>
+        <w:ind w:left="6480" w:hanging="360"/>
+      </w:pPr>
+      <w:rPr>
+        <w:u w:val="none"/>
+      </w:rPr>
+    </w:lvl>
+  </w:abstractNum>
+  <w:abstractNum w:abstractNumId="17" w15:restartNumberingAfterBreak="0">
     <w:nsid w:val="582724AD"/>
     <w:multiLevelType w:val="multilevel"/>
     <w:tmpl w:val="97FACDA8"/>
@@ -4747,7 +5132,7 @@
       </w:rPr>
     </w:lvl>
   </w:abstractNum>
-  <w:abstractNum w:abstractNumId="17" w15:restartNumberingAfterBreak="0">
+  <w:abstractNum w:abstractNumId="18" w15:restartNumberingAfterBreak="0">
     <w:nsid w:val="6CC808CA"/>
     <w:multiLevelType w:val="multilevel"/>
     <w:tmpl w:val="AEEC1544"/>
@@ -4864,7 +5249,7 @@
       </w:rPr>
     </w:lvl>
   </w:abstractNum>
-  <w:abstractNum w:abstractNumId="18" w15:restartNumberingAfterBreak="0">
+  <w:abstractNum w:abstractNumId="19" w15:restartNumberingAfterBreak="0">
     <w:nsid w:val="708C7340"/>
     <w:multiLevelType w:val="multilevel"/>
     <w:tmpl w:val="7DF830CA"/>
@@ -4978,7 +5363,7 @@
       </w:rPr>
     </w:lvl>
   </w:abstractNum>
-  <w:abstractNum w:abstractNumId="19" w15:restartNumberingAfterBreak="0">
+  <w:abstractNum w:abstractNumId="20" w15:restartNumberingAfterBreak="0">
     <w:nsid w:val="7C3839BB"/>
     <w:multiLevelType w:val="multilevel"/>
     <w:tmpl w:val="E03A8E9A"/>
@@ -5092,7 +5477,7 @@
       </w:rPr>
     </w:lvl>
   </w:abstractNum>
-  <w:abstractNum w:abstractNumId="20" w15:restartNumberingAfterBreak="0">
+  <w:abstractNum w:abstractNumId="21" w15:restartNumberingAfterBreak="0">
     <w:nsid w:val="7F08380D"/>
     <w:multiLevelType w:val="multilevel"/>
     <w:tmpl w:val="F5A0BB72"/>
@@ -5215,16 +5600,16 @@
     <w:abstractNumId w:val="2"/>
   </w:num>
   <w:num w:numId="3" w16cid:durableId="235407967">
-    <w:abstractNumId w:val="16"/>
+    <w:abstractNumId w:val="17"/>
   </w:num>
   <w:num w:numId="4" w16cid:durableId="976569683">
     <w:abstractNumId w:val="12"/>
   </w:num>
   <w:num w:numId="5" w16cid:durableId="578952192">
-    <w:abstractNumId w:val="18"/>
+    <w:abstractNumId w:val="19"/>
   </w:num>
   <w:num w:numId="6" w16cid:durableId="1111822715">
-    <w:abstractNumId w:val="19"/>
+    <w:abstractNumId w:val="20"/>
   </w:num>
   <w:num w:numId="7" w16cid:durableId="898369233">
     <w:abstractNumId w:val="6"/>
@@ -5233,7 +5618,7 @@
     <w:abstractNumId w:val="9"/>
   </w:num>
   <w:num w:numId="9" w16cid:durableId="1191603079">
-    <w:abstractNumId w:val="20"/>
+    <w:abstractNumId w:val="21"/>
   </w:num>
   <w:num w:numId="10" w16cid:durableId="846942999">
     <w:abstractNumId w:val="7"/>
@@ -5251,7 +5636,7 @@
     <w:abstractNumId w:val="10"/>
   </w:num>
   <w:num w:numId="15" w16cid:durableId="2039163353">
-    <w:abstractNumId w:val="17"/>
+    <w:abstractNumId w:val="18"/>
   </w:num>
   <w:num w:numId="16" w16cid:durableId="1329014249">
     <w:abstractNumId w:val="8"/>
@@ -5270,6 +5655,9 @@
   </w:num>
   <w:num w:numId="21" w16cid:durableId="2118016287">
     <w:abstractNumId w:val="13"/>
+  </w:num>
+  <w:num w:numId="22" w16cid:durableId="1963924871">
+    <w:abstractNumId w:val="16"/>
   </w:num>
 </w:numbering>
 </file>
@@ -5787,7 +6175,6 @@
   <w:style w:type="character" w:default="1" w:styleId="DefaultParagraphFont">
     <w:name w:val="Default Paragraph Font"/>
     <w:uiPriority w:val="1"/>
-    <w:semiHidden/>
     <w:unhideWhenUsed/>
   </w:style>
   <w:style w:type="table" w:default="1" w:styleId="TableNormal">
@@ -5853,6 +6240,33 @@
       <w:color w:val="666666"/>
       <w:sz w:val="30"/>
       <w:szCs w:val="30"/>
+    </w:rPr>
+  </w:style>
+  <w:style w:type="paragraph" w:styleId="ListParagraph">
+    <w:name w:val="List Paragraph"/>
+    <w:basedOn w:val="Normal"/>
+    <w:uiPriority w:val="34"/>
+    <w:qFormat/>
+    <w:rsid w:val="00E139D4"/>
+    <w:pPr>
+      <w:ind w:left="720"/>
+      <w:contextualSpacing/>
+    </w:pPr>
+  </w:style>
+  <w:style w:type="paragraph" w:styleId="NormalWeb">
+    <w:name w:val="Normal (Web)"/>
+    <w:basedOn w:val="Normal"/>
+    <w:uiPriority w:val="99"/>
+    <w:unhideWhenUsed/>
+    <w:rsid w:val="00E139D4"/>
+    <w:pPr>
+      <w:spacing w:before="100" w:beforeAutospacing="1" w:after="100" w:afterAutospacing="1" w:line="240" w:lineRule="auto"/>
+    </w:pPr>
+    <w:rPr>
+      <w:rFonts w:ascii="Times New Roman" w:eastAsia="Times New Roman" w:hAnsi="Times New Roman" w:cs="Times New Roman"/>
+      <w:sz w:val="24"/>
+      <w:szCs w:val="24"/>
+      <w:lang w:val="en-US"/>
     </w:rPr>
   </w:style>
 </w:styles>

</xml_diff>

<commit_message>
Ai Powered Audio Summarisation using Strategy and Adapter Design patterns
</commit_message>
<xml_diff>
--- a/02_SWR_Architecture/01_Usecases_Features.docx
+++ b/02_SWR_Architecture/01_Usecases_Features.docx
@@ -4,7 +4,7 @@
   <w:body>
     <w:p>
       <w:pPr>
-        <w:pStyle w:val="Heading3"/>
+        <w:pStyle w:val="Titlu3"/>
         <w:spacing w:after="160"/>
       </w:pPr>
       <w:bookmarkStart w:id="0" w:name="_r283tewsepnp" w:colFirst="0" w:colLast="0"/>
@@ -225,7 +225,7 @@
     </w:p>
     <w:p>
       <w:pPr>
-        <w:pStyle w:val="Heading3"/>
+        <w:pStyle w:val="Titlu3"/>
         <w:spacing w:after="160"/>
       </w:pPr>
       <w:bookmarkStart w:id="1" w:name="_z5oy7oikqzrp" w:colFirst="0" w:colLast="0"/>
@@ -374,28 +374,13 @@
     </w:p>
     <w:p>
       <w:pPr>
-        <w:pStyle w:val="Heading3"/>
+        <w:pStyle w:val="Titlu3"/>
         <w:spacing w:after="160"/>
       </w:pPr>
       <w:bookmarkStart w:id="2" w:name="_v40hvc8i25ck" w:colFirst="0" w:colLast="0"/>
       <w:bookmarkEnd w:id="2"/>
       <w:r>
-        <w:t>Teamwork</w:t>
-      </w:r>
-      <w:r>
-        <w:t xml:space="preserve"> </w:t>
-      </w:r>
-      <w:r>
-        <w:t>s</w:t>
-      </w:r>
-      <w:r>
-        <w:t xml:space="preserve">plit (6 </w:t>
-      </w:r>
-      <w:r>
-        <w:t>m</w:t>
-      </w:r>
-      <w:r>
-        <w:t>embers)</w:t>
+        <w:t>Teamwork split (6 members)</w:t>
       </w:r>
     </w:p>
     <w:p>
@@ -610,7 +595,7 @@
     </w:p>
     <w:p>
       <w:pPr>
-        <w:pStyle w:val="Heading3"/>
+        <w:pStyle w:val="Titlu3"/>
         <w:spacing w:after="160"/>
       </w:pPr>
       <w:bookmarkStart w:id="3" w:name="_yhuw0ip8jsa5" w:colFirst="0" w:colLast="0"/>
@@ -934,7 +919,7 @@
     </w:p>
     <w:p>
       <w:pPr>
-        <w:pStyle w:val="Heading3"/>
+        <w:pStyle w:val="Titlu3"/>
         <w:spacing w:after="160"/>
       </w:pPr>
       <w:r>
@@ -943,7 +928,7 @@
     </w:p>
     <w:p>
       <w:pPr>
-        <w:pStyle w:val="ListParagraph"/>
+        <w:pStyle w:val="Listparagraf"/>
         <w:numPr>
           <w:ilvl w:val="0"/>
           <w:numId w:val="16"/>
@@ -975,7 +960,7 @@
     </w:p>
     <w:p>
       <w:pPr>
-        <w:pStyle w:val="ListParagraph"/>
+        <w:pStyle w:val="Listparagraf"/>
         <w:numPr>
           <w:ilvl w:val="0"/>
           <w:numId w:val="16"/>
@@ -1055,18 +1040,7 @@
           <w:szCs w:val="22"/>
           <w:lang w:val="en-GB"/>
         </w:rPr>
-        <w:t>Tactile &amp; Refreshable Braille Display Support (HW Interoperability</w:t>
-      </w:r>
-      <w:r>
-        <w:rPr>
-          <w:rFonts w:ascii="Arial" w:eastAsia="Arial" w:hAnsi="Arial" w:cs="Arial"/>
-          <w:b/>
-          <w:bCs/>
-          <w:sz w:val="22"/>
-          <w:szCs w:val="22"/>
-          <w:lang w:val="en-GB"/>
-        </w:rPr>
-        <w:t>)</w:t>
+        <w:t>Tactile &amp; Refreshable Braille Display Support (HW Interoperability)</w:t>
       </w:r>
       <w:r>
         <w:br/>
@@ -1165,7 +1139,7 @@
     </w:p>
     <w:p>
       <w:pPr>
-        <w:pStyle w:val="Heading3"/>
+        <w:pStyle w:val="Titlu3"/>
         <w:keepNext w:val="0"/>
         <w:keepLines w:val="0"/>
         <w:spacing w:before="0" w:after="0"/>
@@ -1356,7 +1330,7 @@
     </w:p>
     <w:p>
       <w:pPr>
-        <w:pStyle w:val="Heading3"/>
+        <w:pStyle w:val="Titlu3"/>
         <w:keepNext w:val="0"/>
         <w:keepLines w:val="0"/>
         <w:spacing w:before="0" w:after="0"/>
@@ -1383,7 +1357,7 @@
     </w:p>
     <w:p>
       <w:pPr>
-        <w:pStyle w:val="Heading4"/>
+        <w:pStyle w:val="Titlu4"/>
         <w:keepNext w:val="0"/>
         <w:keepLines w:val="0"/>
         <w:spacing w:before="0" w:after="0"/>
@@ -1559,7 +1533,7 @@
     </w:p>
     <w:p>
       <w:pPr>
-        <w:pStyle w:val="Heading4"/>
+        <w:pStyle w:val="Titlu4"/>
         <w:keepNext w:val="0"/>
         <w:keepLines w:val="0"/>
         <w:spacing w:before="0" w:after="0"/>
@@ -1741,7 +1715,7 @@
     </w:p>
     <w:p>
       <w:pPr>
-        <w:pStyle w:val="Heading4"/>
+        <w:pStyle w:val="Titlu4"/>
         <w:keepNext w:val="0"/>
         <w:keepLines w:val="0"/>
         <w:spacing w:before="0" w:after="0"/>
@@ -2020,7 +1994,7 @@
     </w:p>
     <w:p>
       <w:pPr>
-        <w:pStyle w:val="Heading4"/>
+        <w:pStyle w:val="Titlu4"/>
         <w:keepNext w:val="0"/>
         <w:keepLines w:val="0"/>
         <w:spacing w:before="0" w:after="0"/>
@@ -2157,7 +2131,7 @@
     </w:p>
     <w:p>
       <w:pPr>
-        <w:pStyle w:val="Heading3"/>
+        <w:pStyle w:val="Titlu3"/>
         <w:keepNext w:val="0"/>
         <w:keepLines w:val="0"/>
         <w:spacing w:before="0"/>
@@ -2492,7 +2466,7 @@
     <w:p/>
     <w:p>
       <w:pPr>
-        <w:pStyle w:val="Heading3"/>
+        <w:pStyle w:val="Titlu3"/>
         <w:keepNext w:val="0"/>
         <w:keepLines w:val="0"/>
         <w:spacing w:before="0"/>
@@ -3083,7 +3057,7 @@
       <w:lvlText w:val="●"/>
       <w:lvlJc w:val="left"/>
       <w:pPr>
-        <w:ind w:left="720" w:hanging="360"/>
+        <w:ind w:left="4329" w:hanging="360"/>
       </w:pPr>
       <w:rPr>
         <w:rFonts w:ascii="Arial" w:eastAsia="Arial" w:hAnsi="Arial" w:cs="Arial"/>
@@ -3096,7 +3070,7 @@
       <w:lvlText w:val="○"/>
       <w:lvlJc w:val="left"/>
       <w:pPr>
-        <w:ind w:left="1440" w:hanging="360"/>
+        <w:ind w:left="5049" w:hanging="360"/>
       </w:pPr>
       <w:rPr>
         <w:u w:val="none"/>
@@ -3108,7 +3082,7 @@
       <w:lvlText w:val="■"/>
       <w:lvlJc w:val="left"/>
       <w:pPr>
-        <w:ind w:left="2160" w:hanging="360"/>
+        <w:ind w:left="5769" w:hanging="360"/>
       </w:pPr>
       <w:rPr>
         <w:u w:val="none"/>
@@ -3120,7 +3094,7 @@
       <w:lvlText w:val="●"/>
       <w:lvlJc w:val="left"/>
       <w:pPr>
-        <w:ind w:left="2880" w:hanging="360"/>
+        <w:ind w:left="6489" w:hanging="360"/>
       </w:pPr>
       <w:rPr>
         <w:u w:val="none"/>
@@ -3132,7 +3106,7 @@
       <w:lvlText w:val="○"/>
       <w:lvlJc w:val="left"/>
       <w:pPr>
-        <w:ind w:left="3600" w:hanging="360"/>
+        <w:ind w:left="7209" w:hanging="360"/>
       </w:pPr>
       <w:rPr>
         <w:u w:val="none"/>
@@ -3144,7 +3118,7 @@
       <w:lvlText w:val="■"/>
       <w:lvlJc w:val="left"/>
       <w:pPr>
-        <w:ind w:left="4320" w:hanging="360"/>
+        <w:ind w:left="7929" w:hanging="360"/>
       </w:pPr>
       <w:rPr>
         <w:u w:val="none"/>
@@ -3156,7 +3130,7 @@
       <w:lvlText w:val="●"/>
       <w:lvlJc w:val="left"/>
       <w:pPr>
-        <w:ind w:left="5040" w:hanging="360"/>
+        <w:ind w:left="8649" w:hanging="360"/>
       </w:pPr>
       <w:rPr>
         <w:u w:val="none"/>
@@ -3168,7 +3142,7 @@
       <w:lvlText w:val="○"/>
       <w:lvlJc w:val="left"/>
       <w:pPr>
-        <w:ind w:left="5760" w:hanging="360"/>
+        <w:ind w:left="9369" w:hanging="360"/>
       </w:pPr>
       <w:rPr>
         <w:u w:val="none"/>
@@ -3180,7 +3154,7 @@
       <w:lvlText w:val="■"/>
       <w:lvlJc w:val="left"/>
       <w:pPr>
-        <w:ind w:left="6480" w:hanging="360"/>
+        <w:ind w:left="10089" w:hanging="360"/>
       </w:pPr>
       <w:rPr>
         <w:u w:val="none"/>
@@ -6061,7 +6035,7 @@
     <w:name w:val="Normal"/>
     <w:qFormat/>
   </w:style>
-  <w:style w:type="paragraph" w:styleId="Heading1">
+  <w:style w:type="paragraph" w:styleId="Titlu1">
     <w:name w:val="heading 1"/>
     <w:basedOn w:val="Normal"/>
     <w:next w:val="Normal"/>
@@ -6078,7 +6052,7 @@
       <w:szCs w:val="40"/>
     </w:rPr>
   </w:style>
-  <w:style w:type="paragraph" w:styleId="Heading2">
+  <w:style w:type="paragraph" w:styleId="Titlu2">
     <w:name w:val="heading 2"/>
     <w:basedOn w:val="Normal"/>
     <w:next w:val="Normal"/>
@@ -6096,7 +6070,7 @@
       <w:szCs w:val="32"/>
     </w:rPr>
   </w:style>
-  <w:style w:type="paragraph" w:styleId="Heading3">
+  <w:style w:type="paragraph" w:styleId="Titlu3">
     <w:name w:val="heading 3"/>
     <w:basedOn w:val="Normal"/>
     <w:next w:val="Normal"/>
@@ -6115,7 +6089,7 @@
       <w:szCs w:val="28"/>
     </w:rPr>
   </w:style>
-  <w:style w:type="paragraph" w:styleId="Heading4">
+  <w:style w:type="paragraph" w:styleId="Titlu4">
     <w:name w:val="heading 4"/>
     <w:basedOn w:val="Normal"/>
     <w:next w:val="Normal"/>
@@ -6134,7 +6108,7 @@
       <w:szCs w:val="24"/>
     </w:rPr>
   </w:style>
-  <w:style w:type="paragraph" w:styleId="Heading5">
+  <w:style w:type="paragraph" w:styleId="Titlu5">
     <w:name w:val="heading 5"/>
     <w:basedOn w:val="Normal"/>
     <w:next w:val="Normal"/>
@@ -6152,7 +6126,7 @@
       <w:color w:val="666666"/>
     </w:rPr>
   </w:style>
-  <w:style w:type="paragraph" w:styleId="Heading6">
+  <w:style w:type="paragraph" w:styleId="Titlu6">
     <w:name w:val="heading 6"/>
     <w:basedOn w:val="Normal"/>
     <w:next w:val="Normal"/>
@@ -6172,12 +6146,13 @@
       <w:color w:val="666666"/>
     </w:rPr>
   </w:style>
-  <w:style w:type="character" w:default="1" w:styleId="DefaultParagraphFont">
+  <w:style w:type="character" w:default="1" w:styleId="Fontdeparagrafimplicit">
     <w:name w:val="Default Paragraph Font"/>
     <w:uiPriority w:val="1"/>
+    <w:semiHidden/>
     <w:unhideWhenUsed/>
   </w:style>
-  <w:style w:type="table" w:default="1" w:styleId="TableNormal">
+  <w:style w:type="table" w:default="1" w:styleId="TabelNormal">
     <w:name w:val="Normal Table"/>
     <w:uiPriority w:val="99"/>
     <w:semiHidden/>
@@ -6192,13 +6167,13 @@
       </w:tblCellMar>
     </w:tblPr>
   </w:style>
-  <w:style w:type="numbering" w:default="1" w:styleId="NoList">
+  <w:style w:type="numbering" w:default="1" w:styleId="FrListare">
     <w:name w:val="No List"/>
     <w:uiPriority w:val="99"/>
     <w:semiHidden/>
     <w:unhideWhenUsed/>
   </w:style>
-  <w:style w:type="table" w:customStyle="1" w:styleId="TableNormal0">
+  <w:style w:type="table" w:customStyle="1" w:styleId="TableNormal">
     <w:name w:val="TableNormal"/>
     <w:tblPr>
       <w:tblCellMar>
@@ -6209,7 +6184,7 @@
       </w:tblCellMar>
     </w:tblPr>
   </w:style>
-  <w:style w:type="paragraph" w:styleId="Title">
+  <w:style w:type="paragraph" w:styleId="Titlu">
     <w:name w:val="Title"/>
     <w:basedOn w:val="Normal"/>
     <w:next w:val="Normal"/>
@@ -6225,7 +6200,7 @@
       <w:szCs w:val="52"/>
     </w:rPr>
   </w:style>
-  <w:style w:type="paragraph" w:styleId="Subtitle">
+  <w:style w:type="paragraph" w:styleId="Subtitlu">
     <w:name w:val="Subtitle"/>
     <w:basedOn w:val="Normal"/>
     <w:next w:val="Normal"/>
@@ -6242,7 +6217,7 @@
       <w:szCs w:val="30"/>
     </w:rPr>
   </w:style>
-  <w:style w:type="paragraph" w:styleId="ListParagraph">
+  <w:style w:type="paragraph" w:styleId="Listparagraf">
     <w:name w:val="List Paragraph"/>
     <w:basedOn w:val="Normal"/>
     <w:uiPriority w:val="34"/>

</xml_diff>